<commit_message>
fix: did signout button styling changes
</commit_message>
<xml_diff>
--- a/Summary.docx
+++ b/Summary.docx
@@ -71,21 +71,12 @@
           <w:szCs w:val="28"/>
         </w:rPr>
       </w:pPr>
-      <w:proofErr w:type="spellStart"/>
-      <w:r>
-        <w:rPr>
-          <w:sz w:val="28"/>
-          <w:szCs w:val="28"/>
-        </w:rPr>
-        <w:t>venv</w:t>
-      </w:r>
-      <w:proofErr w:type="spellEnd"/>
-      <w:r>
-        <w:rPr>
-          <w:sz w:val="28"/>
-          <w:szCs w:val="28"/>
-        </w:rPr>
-        <w:t>\Scripts\activate</w:t>
+      <w:r>
+        <w:rPr>
+          <w:sz w:val="28"/>
+          <w:szCs w:val="28"/>
+        </w:rPr>
+        <w:t>venv\Scripts\activate</w:t>
       </w:r>
     </w:p>
     <w:p>
@@ -97,37 +88,12 @@
           <w:szCs w:val="28"/>
         </w:rPr>
       </w:pPr>
-      <w:proofErr w:type="spellStart"/>
-      <w:r>
-        <w:rPr>
-          <w:sz w:val="28"/>
-          <w:szCs w:val="28"/>
-        </w:rPr>
-        <w:t>uvicorn</w:t>
-      </w:r>
-      <w:proofErr w:type="spellEnd"/>
-      <w:r>
-        <w:rPr>
-          <w:sz w:val="28"/>
-          <w:szCs w:val="28"/>
-        </w:rPr>
-        <w:t xml:space="preserve"> </w:t>
-      </w:r>
-      <w:proofErr w:type="spellStart"/>
-      <w:r>
-        <w:rPr>
-          <w:sz w:val="28"/>
-          <w:szCs w:val="28"/>
-        </w:rPr>
-        <w:t>main:app</w:t>
-      </w:r>
-      <w:proofErr w:type="spellEnd"/>
-      <w:r>
-        <w:rPr>
-          <w:sz w:val="28"/>
-          <w:szCs w:val="28"/>
-        </w:rPr>
-        <w:t xml:space="preserve"> --reload --port 8000</w:t>
+      <w:r>
+        <w:rPr>
+          <w:sz w:val="28"/>
+          <w:szCs w:val="28"/>
+        </w:rPr>
+        <w:t>uvicorn main:app --reload --port 8000</w:t>
       </w:r>
     </w:p>
     <w:p>
@@ -175,7 +141,6 @@
           <w:szCs w:val="28"/>
         </w:rPr>
       </w:pPr>
-      <w:proofErr w:type="spellStart"/>
       <w:r>
         <w:rPr>
           <w:b/>
@@ -183,88 +148,477 @@
           <w:sz w:val="28"/>
           <w:szCs w:val="28"/>
         </w:rPr>
-        <w:t>pnpm</w:t>
-      </w:r>
-      <w:proofErr w:type="spellEnd"/>
-      <w:r>
+        <w:t>pnpm dev</w:t>
+      </w:r>
+    </w:p>
+    <w:p>
+      <w:pPr>
         <w:rPr>
           <w:b/>
           <w:bCs/>
           <w:sz w:val="28"/>
           <w:szCs w:val="28"/>
         </w:rPr>
-        <w:t xml:space="preserve"> dev</w:t>
-      </w:r>
-    </w:p>
-    <w:p>
-      <w:pPr>
+      </w:pPr>
+      <w:r>
         <w:rPr>
           <w:b/>
           <w:bCs/>
           <w:sz w:val="28"/>
           <w:szCs w:val="28"/>
         </w:rPr>
-      </w:pPr>
-      <w:r>
+        <w:t>Terminal 3[ngrok (in development stage)]</w:t>
+      </w:r>
+    </w:p>
+    <w:p>
+      <w:pPr>
+        <w:pStyle w:val="ListParagraph"/>
+        <w:rPr>
+          <w:sz w:val="28"/>
+          <w:szCs w:val="28"/>
+        </w:rPr>
+      </w:pPr>
+      <w:r>
+        <w:rPr>
+          <w:sz w:val="28"/>
+          <w:szCs w:val="28"/>
+        </w:rPr>
+        <w:t>cd D:\Projects\firstsenior</w:t>
+      </w:r>
+    </w:p>
+    <w:p>
+      <w:pPr>
+        <w:pStyle w:val="ListParagraph"/>
+        <w:rPr>
+          <w:sz w:val="28"/>
+          <w:szCs w:val="28"/>
+        </w:rPr>
+      </w:pPr>
+      <w:r>
+        <w:rPr>
+          <w:sz w:val="28"/>
+          <w:szCs w:val="28"/>
+        </w:rPr>
+        <w:t>.\ngrok.exe http 8000</w:t>
+      </w:r>
+    </w:p>
+    <w:p>
+      <w:pPr>
+        <w:rPr>
+          <w:sz w:val="28"/>
+          <w:szCs w:val="28"/>
+        </w:rPr>
+      </w:pPr>
+    </w:p>
+    <w:p>
+      <w:pPr>
         <w:rPr>
           <w:b/>
           <w:bCs/>
-          <w:sz w:val="28"/>
-          <w:szCs w:val="28"/>
-        </w:rPr>
-        <w:t>Terminal 3[</w:t>
-      </w:r>
-      <w:proofErr w:type="spellStart"/>
+          <w:sz w:val="36"/>
+          <w:szCs w:val="36"/>
+        </w:rPr>
+      </w:pPr>
       <w:r>
         <w:rPr>
           <w:b/>
           <w:bCs/>
-          <w:sz w:val="28"/>
-          <w:szCs w:val="28"/>
-        </w:rPr>
-        <w:t>ngrok</w:t>
-      </w:r>
-      <w:proofErr w:type="spellEnd"/>
-      <w:r>
+          <w:sz w:val="36"/>
+          <w:szCs w:val="36"/>
+        </w:rPr>
+        <w:t>Project configuration</w:t>
+      </w:r>
+    </w:p>
+    <w:p>
+      <w:pPr>
         <w:rPr>
           <w:b/>
           <w:bCs/>
           <w:sz w:val="28"/>
           <w:szCs w:val="28"/>
         </w:rPr>
-        <w:t xml:space="preserve"> (in development stage)]</w:t>
+      </w:pPr>
+      <w:r>
+        <w:rPr>
+          <w:b/>
+          <w:bCs/>
+          <w:sz w:val="28"/>
+          <w:szCs w:val="28"/>
+        </w:rPr>
+        <w:t>GitHub OAuth App</w:t>
       </w:r>
     </w:p>
     <w:p>
       <w:pPr>
         <w:pStyle w:val="ListParagraph"/>
-        <w:rPr>
-          <w:sz w:val="28"/>
-          <w:szCs w:val="28"/>
-        </w:rPr>
-      </w:pPr>
-      <w:r>
-        <w:rPr>
-          <w:sz w:val="28"/>
-          <w:szCs w:val="28"/>
-        </w:rPr>
-        <w:t>cd D:\Projects\firstsenior</w:t>
+        <w:numPr>
+          <w:ilvl w:val="0"/>
+          <w:numId w:val="5"/>
+        </w:numPr>
+        <w:rPr>
+          <w:sz w:val="28"/>
+          <w:szCs w:val="28"/>
+        </w:rPr>
+      </w:pPr>
+      <w:r>
+        <w:rPr>
+          <w:sz w:val="28"/>
+          <w:szCs w:val="28"/>
+        </w:rPr>
+        <w:t>Homepage URL:</w:t>
+      </w:r>
+      <w:r>
+        <w:rPr>
+          <w:sz w:val="28"/>
+          <w:szCs w:val="28"/>
+        </w:rPr>
+        <w:t xml:space="preserve"> “”</w:t>
       </w:r>
     </w:p>
     <w:p>
       <w:pPr>
         <w:pStyle w:val="ListParagraph"/>
-        <w:rPr>
-          <w:sz w:val="28"/>
-          <w:szCs w:val="28"/>
-        </w:rPr>
-      </w:pPr>
-      <w:r>
-        <w:rPr>
-          <w:sz w:val="28"/>
-          <w:szCs w:val="28"/>
-        </w:rPr>
-        <w:t>.\ngrok.exe http 8000</w:t>
+        <w:numPr>
+          <w:ilvl w:val="0"/>
+          <w:numId w:val="5"/>
+        </w:numPr>
+        <w:rPr>
+          <w:b/>
+          <w:bCs/>
+          <w:sz w:val="28"/>
+          <w:szCs w:val="28"/>
+        </w:rPr>
+      </w:pPr>
+      <w:r>
+        <w:rPr>
+          <w:sz w:val="28"/>
+          <w:szCs w:val="28"/>
+        </w:rPr>
+        <w:t>Callback URL: “”</w:t>
+      </w:r>
+    </w:p>
+    <w:p>
+      <w:pPr>
+        <w:ind w:left="360"/>
+        <w:rPr>
+          <w:sz w:val="28"/>
+          <w:szCs w:val="28"/>
+        </w:rPr>
+      </w:pPr>
+      <w:r>
+        <w:rPr>
+          <w:sz w:val="28"/>
+          <w:szCs w:val="28"/>
+        </w:rPr>
+        <w:t>Go to github.com/settings/developers → FirstSenior</w:t>
+      </w:r>
+      <w:r>
+        <w:rPr>
+          <w:sz w:val="28"/>
+          <w:szCs w:val="28"/>
+        </w:rPr>
+        <w:t xml:space="preserve"> change the URL according to the local or live application</w:t>
+      </w:r>
+    </w:p>
+    <w:p>
+      <w:pPr>
+        <w:rPr>
+          <w:b/>
+          <w:bCs/>
+          <w:sz w:val="28"/>
+          <w:szCs w:val="28"/>
+        </w:rPr>
+      </w:pPr>
+      <w:r>
+        <w:rPr>
+          <w:b/>
+          <w:bCs/>
+          <w:sz w:val="28"/>
+          <w:szCs w:val="28"/>
+        </w:rPr>
+        <w:t>GitHub Webhook</w:t>
+      </w:r>
+    </w:p>
+    <w:p>
+      <w:pPr>
+        <w:pStyle w:val="ListParagraph"/>
+        <w:numPr>
+          <w:ilvl w:val="0"/>
+          <w:numId w:val="6"/>
+        </w:numPr>
+        <w:rPr>
+          <w:sz w:val="28"/>
+          <w:szCs w:val="28"/>
+        </w:rPr>
+      </w:pPr>
+      <w:r>
+        <w:rPr>
+          <w:sz w:val="28"/>
+          <w:szCs w:val="28"/>
+        </w:rPr>
+        <w:t>Payload URL:</w:t>
+      </w:r>
+      <w:r>
+        <w:rPr>
+          <w:sz w:val="28"/>
+          <w:szCs w:val="28"/>
+        </w:rPr>
+        <w:t>””</w:t>
+      </w:r>
+    </w:p>
+    <w:p>
+      <w:pPr>
+        <w:ind w:left="360"/>
+        <w:rPr>
+          <w:sz w:val="28"/>
+          <w:szCs w:val="28"/>
+        </w:rPr>
+      </w:pPr>
+      <w:r>
+        <w:rPr>
+          <w:sz w:val="28"/>
+          <w:szCs w:val="28"/>
+        </w:rPr>
+        <w:t>Go to github.com/rajeshrk10/firstsenior → Settings → Webhooks → update</w:t>
+      </w:r>
+      <w:r>
+        <w:rPr>
+          <w:sz w:val="28"/>
+          <w:szCs w:val="28"/>
+        </w:rPr>
+        <w:t>.</w:t>
+      </w:r>
+    </w:p>
+    <w:p>
+      <w:pPr>
+        <w:rPr>
+          <w:b/>
+          <w:bCs/>
+          <w:sz w:val="28"/>
+          <w:szCs w:val="28"/>
+        </w:rPr>
+      </w:pPr>
+      <w:r>
+        <w:rPr>
+          <w:b/>
+          <w:bCs/>
+          <w:sz w:val="28"/>
+          <w:szCs w:val="28"/>
+        </w:rPr>
+        <w:t>Vercel Environment Variables</w:t>
+      </w:r>
+    </w:p>
+    <w:p>
+      <w:pPr>
+        <w:rPr>
+          <w:sz w:val="28"/>
+          <w:szCs w:val="28"/>
+        </w:rPr>
+      </w:pPr>
+      <w:r>
+        <w:rPr>
+          <w:sz w:val="28"/>
+          <w:szCs w:val="28"/>
+        </w:rPr>
+        <w:t>Go to Vercel → Settings → Environment Variables. Make sure these are set:</w:t>
+      </w:r>
+    </w:p>
+    <w:p>
+      <w:pPr>
+        <w:pStyle w:val="ListParagraph"/>
+        <w:numPr>
+          <w:ilvl w:val="0"/>
+          <w:numId w:val="6"/>
+        </w:numPr>
+        <w:rPr>
+          <w:sz w:val="28"/>
+          <w:szCs w:val="28"/>
+        </w:rPr>
+      </w:pPr>
+      <w:r>
+        <w:rPr>
+          <w:sz w:val="28"/>
+          <w:szCs w:val="28"/>
+        </w:rPr>
+        <w:t>NEXTAUTH_URL=https://firstsenior-q8du6n1wq-rajeshkumarrk101998-4413s-projects.vercel.app</w:t>
+      </w:r>
+    </w:p>
+    <w:p>
+      <w:pPr>
+        <w:pStyle w:val="ListParagraph"/>
+        <w:numPr>
+          <w:ilvl w:val="0"/>
+          <w:numId w:val="6"/>
+        </w:numPr>
+        <w:rPr>
+          <w:sz w:val="28"/>
+          <w:szCs w:val="28"/>
+        </w:rPr>
+      </w:pPr>
+      <w:r>
+        <w:rPr>
+          <w:sz w:val="28"/>
+          <w:szCs w:val="28"/>
+        </w:rPr>
+        <w:t>NEXTAUTH_SECRET=firstsenior_secret_key_123</w:t>
+      </w:r>
+    </w:p>
+    <w:p>
+      <w:pPr>
+        <w:pStyle w:val="ListParagraph"/>
+        <w:numPr>
+          <w:ilvl w:val="0"/>
+          <w:numId w:val="6"/>
+        </w:numPr>
+        <w:rPr>
+          <w:sz w:val="28"/>
+          <w:szCs w:val="28"/>
+        </w:rPr>
+      </w:pPr>
+      <w:r>
+        <w:rPr>
+          <w:sz w:val="28"/>
+          <w:szCs w:val="28"/>
+        </w:rPr>
+        <w:lastRenderedPageBreak/>
+        <w:t>GITHUB_CLIENT_ID=</w:t>
+      </w:r>
+      <w:r>
+        <w:rPr>
+          <w:sz w:val="28"/>
+          <w:szCs w:val="28"/>
+        </w:rPr>
+        <w:t>””</w:t>
+      </w:r>
+    </w:p>
+    <w:p>
+      <w:pPr>
+        <w:pStyle w:val="ListParagraph"/>
+        <w:numPr>
+          <w:ilvl w:val="0"/>
+          <w:numId w:val="6"/>
+        </w:numPr>
+        <w:rPr>
+          <w:sz w:val="28"/>
+          <w:szCs w:val="28"/>
+        </w:rPr>
+      </w:pPr>
+      <w:r>
+        <w:rPr>
+          <w:sz w:val="28"/>
+          <w:szCs w:val="28"/>
+        </w:rPr>
+        <w:t>GITHUB_CLIENT_SECRET=</w:t>
+      </w:r>
+      <w:r>
+        <w:rPr>
+          <w:sz w:val="28"/>
+          <w:szCs w:val="28"/>
+        </w:rPr>
+        <w:t>””</w:t>
+      </w:r>
+    </w:p>
+    <w:p>
+      <w:pPr>
+        <w:pStyle w:val="ListParagraph"/>
+        <w:numPr>
+          <w:ilvl w:val="0"/>
+          <w:numId w:val="6"/>
+        </w:numPr>
+        <w:rPr>
+          <w:sz w:val="28"/>
+          <w:szCs w:val="28"/>
+        </w:rPr>
+      </w:pPr>
+      <w:r>
+        <w:rPr>
+          <w:sz w:val="28"/>
+          <w:szCs w:val="28"/>
+        </w:rPr>
+        <w:t>NEXT_PUBLIC_API_URL=</w:t>
+      </w:r>
+      <w:r>
+        <w:rPr>
+          <w:sz w:val="28"/>
+          <w:szCs w:val="28"/>
+        </w:rPr>
+        <w:t>””</w:t>
+      </w:r>
+    </w:p>
+    <w:p>
+      <w:pPr>
+        <w:rPr>
+          <w:b/>
+          <w:bCs/>
+          <w:sz w:val="28"/>
+          <w:szCs w:val="28"/>
+        </w:rPr>
+      </w:pPr>
+      <w:r>
+        <w:rPr>
+          <w:b/>
+          <w:bCs/>
+          <w:sz w:val="28"/>
+          <w:szCs w:val="28"/>
+        </w:rPr>
+        <w:t>Railway Environment Variables</w:t>
+      </w:r>
+    </w:p>
+    <w:p>
+      <w:pPr>
+        <w:rPr>
+          <w:sz w:val="28"/>
+          <w:szCs w:val="28"/>
+        </w:rPr>
+      </w:pPr>
+      <w:r>
+        <w:rPr>
+          <w:sz w:val="28"/>
+          <w:szCs w:val="28"/>
+        </w:rPr>
+        <w:t>Go to Railway → your service → Variables. Make sure these are set</w:t>
+      </w:r>
+    </w:p>
+    <w:p>
+      <w:pPr>
+        <w:pStyle w:val="ListParagraph"/>
+        <w:numPr>
+          <w:ilvl w:val="0"/>
+          <w:numId w:val="8"/>
+        </w:numPr>
+        <w:rPr>
+          <w:sz w:val="28"/>
+          <w:szCs w:val="28"/>
+        </w:rPr>
+      </w:pPr>
+      <w:r>
+        <w:rPr>
+          <w:sz w:val="28"/>
+          <w:szCs w:val="28"/>
+        </w:rPr>
+        <w:t>DATABASE_URL=your_neon_connection_string GROQ_API_KEY=your_groq_key GITHUB_WEBHOOK_SECRET=firstsenior123 GITHUB_CLIENT_ID=your_client_id GITHUB_CLIENT_SECRET=your_client_secret</w:t>
+      </w:r>
+    </w:p>
+    <w:p>
+      <w:pPr>
+        <w:rPr>
+          <w:sz w:val="28"/>
+          <w:szCs w:val="28"/>
+        </w:rPr>
+      </w:pPr>
+      <w:r>
+        <w:rPr>
+          <w:sz w:val="28"/>
+          <w:szCs w:val="28"/>
+        </w:rPr>
+        <w:t xml:space="preserve">Client secret </w:t>
+      </w:r>
+      <w:r>
+        <w:rPr>
+          <w:sz w:val="28"/>
+          <w:szCs w:val="28"/>
+        </w:rPr>
+        <w:t>604daf9c02187bb891800888ce048aa01dea08f9</w:t>
       </w:r>
     </w:p>
     <w:sectPr>
@@ -280,6 +634,345 @@
 <file path=word/numbering.xml><?xml version="1.0" encoding="utf-8"?>
 <w:numbering xmlns:wpc="http://schemas.microsoft.com/office/word/2010/wordprocessingCanvas" xmlns:cx="http://schemas.microsoft.com/office/drawing/2014/chartex" xmlns:cx1="http://schemas.microsoft.com/office/drawing/2015/9/8/chartex" xmlns:cx2="http://schemas.microsoft.com/office/drawing/2015/10/21/chartex" xmlns:cx3="http://schemas.microsoft.com/office/drawing/2016/5/9/chartex" xmlns:cx4="http://schemas.microsoft.com/office/drawing/2016/5/10/chartex" xmlns:cx5="http://schemas.microsoft.com/office/drawing/2016/5/11/chartex" xmlns:cx6="http://schemas.microsoft.com/office/drawing/2016/5/12/chartex" xmlns:cx7="http://schemas.microsoft.com/office/drawing/2016/5/13/chartex" xmlns:cx8="http://schemas.microsoft.com/office/drawing/2016/5/14/chartex" xmlns:mc="http://schemas.openxmlformats.org/markup-compatibility/2006" xmlns:aink="http://schemas.microsoft.com/office/drawing/2016/ink" xmlns:am3d="http://schemas.microsoft.com/office/drawing/2017/model3d" xmlns:o="urn:schemas-microsoft-com:office:office" xmlns:oel="http://schemas.microsoft.com/office/2019/extlst" xmlns:r="http://schemas.openxmlformats.org/officeDocument/2006/relationships" xmlns:m="http://schemas.openxmlformats.org/officeDocument/2006/math" xmlns:v="urn:schemas-microsoft-com:vml" xmlns:wp14="http://schemas.microsoft.com/office/word/2010/wordprocessingDrawing" xmlns:wp="http://schemas.openxmlformats.org/drawingml/2006/wordprocessingDrawing" xmlns:w10="urn:schemas-microsoft-com:office:word" xmlns:w="http://schemas.openxmlformats.org/wordprocessingml/2006/main" xmlns:w14="http://schemas.microsoft.com/office/word/2010/wordml" xmlns:w15="http://schemas.microsoft.com/office/word/2012/wordml" xmlns:w16cex="http://schemas.microsoft.com/office/word/2018/wordml/cex" xmlns:w16cid="http://schemas.microsoft.com/office/word/2016/wordml/cid" xmlns:w16="http://schemas.microsoft.com/office/word/2018/wordml" xmlns:w16du="http://schemas.microsoft.com/office/word/2023/wordml/word16du" xmlns:w16sdtdh="http://schemas.microsoft.com/office/word/2020/wordml/sdtdatahash" xmlns:w16sdtfl="http://schemas.microsoft.com/office/word/2024/wordml/sdtformatlock" xmlns:w16se="http://schemas.microsoft.com/office/word/2015/wordml/symex" xmlns:wpg="http://schemas.microsoft.com/office/word/2010/wordprocessingGroup" xmlns:wpi="http://schemas.microsoft.com/office/word/2010/wordprocessingInk" xmlns:wne="http://schemas.microsoft.com/office/word/2006/wordml" xmlns:wps="http://schemas.microsoft.com/office/word/2010/wordprocessingShape" mc:Ignorable="w14 w15 w16se w16cid w16 w16cex w16sdtdh w16sdtfl w16du wp14">
   <w:abstractNum w:abstractNumId="0" w15:restartNumberingAfterBreak="0">
+    <w:nsid w:val="0BA91126"/>
+    <w:multiLevelType w:val="hybridMultilevel"/>
+    <w:tmpl w:val="4536A63C"/>
+    <w:lvl w:ilvl="0" w:tplc="40090001">
+      <w:start w:val="1"/>
+      <w:numFmt w:val="bullet"/>
+      <w:lvlText w:val=""/>
+      <w:lvlJc w:val="left"/>
+      <w:pPr>
+        <w:ind w:left="720" w:hanging="360"/>
+      </w:pPr>
+      <w:rPr>
+        <w:rFonts w:ascii="Symbol" w:hAnsi="Symbol" w:hint="default"/>
+      </w:rPr>
+    </w:lvl>
+    <w:lvl w:ilvl="1" w:tplc="40090003" w:tentative="1">
+      <w:start w:val="1"/>
+      <w:numFmt w:val="bullet"/>
+      <w:lvlText w:val="o"/>
+      <w:lvlJc w:val="left"/>
+      <w:pPr>
+        <w:ind w:left="1440" w:hanging="360"/>
+      </w:pPr>
+      <w:rPr>
+        <w:rFonts w:ascii="Courier New" w:hAnsi="Courier New" w:cs="Courier New" w:hint="default"/>
+      </w:rPr>
+    </w:lvl>
+    <w:lvl w:ilvl="2" w:tplc="40090005" w:tentative="1">
+      <w:start w:val="1"/>
+      <w:numFmt w:val="bullet"/>
+      <w:lvlText w:val=""/>
+      <w:lvlJc w:val="left"/>
+      <w:pPr>
+        <w:ind w:left="2160" w:hanging="360"/>
+      </w:pPr>
+      <w:rPr>
+        <w:rFonts w:ascii="Wingdings" w:hAnsi="Wingdings" w:hint="default"/>
+      </w:rPr>
+    </w:lvl>
+    <w:lvl w:ilvl="3" w:tplc="40090001" w:tentative="1">
+      <w:start w:val="1"/>
+      <w:numFmt w:val="bullet"/>
+      <w:lvlText w:val=""/>
+      <w:lvlJc w:val="left"/>
+      <w:pPr>
+        <w:ind w:left="2880" w:hanging="360"/>
+      </w:pPr>
+      <w:rPr>
+        <w:rFonts w:ascii="Symbol" w:hAnsi="Symbol" w:hint="default"/>
+      </w:rPr>
+    </w:lvl>
+    <w:lvl w:ilvl="4" w:tplc="40090003" w:tentative="1">
+      <w:start w:val="1"/>
+      <w:numFmt w:val="bullet"/>
+      <w:lvlText w:val="o"/>
+      <w:lvlJc w:val="left"/>
+      <w:pPr>
+        <w:ind w:left="3600" w:hanging="360"/>
+      </w:pPr>
+      <w:rPr>
+        <w:rFonts w:ascii="Courier New" w:hAnsi="Courier New" w:cs="Courier New" w:hint="default"/>
+      </w:rPr>
+    </w:lvl>
+    <w:lvl w:ilvl="5" w:tplc="40090005" w:tentative="1">
+      <w:start w:val="1"/>
+      <w:numFmt w:val="bullet"/>
+      <w:lvlText w:val=""/>
+      <w:lvlJc w:val="left"/>
+      <w:pPr>
+        <w:ind w:left="4320" w:hanging="360"/>
+      </w:pPr>
+      <w:rPr>
+        <w:rFonts w:ascii="Wingdings" w:hAnsi="Wingdings" w:hint="default"/>
+      </w:rPr>
+    </w:lvl>
+    <w:lvl w:ilvl="6" w:tplc="40090001" w:tentative="1">
+      <w:start w:val="1"/>
+      <w:numFmt w:val="bullet"/>
+      <w:lvlText w:val=""/>
+      <w:lvlJc w:val="left"/>
+      <w:pPr>
+        <w:ind w:left="5040" w:hanging="360"/>
+      </w:pPr>
+      <w:rPr>
+        <w:rFonts w:ascii="Symbol" w:hAnsi="Symbol" w:hint="default"/>
+      </w:rPr>
+    </w:lvl>
+    <w:lvl w:ilvl="7" w:tplc="40090003" w:tentative="1">
+      <w:start w:val="1"/>
+      <w:numFmt w:val="bullet"/>
+      <w:lvlText w:val="o"/>
+      <w:lvlJc w:val="left"/>
+      <w:pPr>
+        <w:ind w:left="5760" w:hanging="360"/>
+      </w:pPr>
+      <w:rPr>
+        <w:rFonts w:ascii="Courier New" w:hAnsi="Courier New" w:cs="Courier New" w:hint="default"/>
+      </w:rPr>
+    </w:lvl>
+    <w:lvl w:ilvl="8" w:tplc="40090005" w:tentative="1">
+      <w:start w:val="1"/>
+      <w:numFmt w:val="bullet"/>
+      <w:lvlText w:val=""/>
+      <w:lvlJc w:val="left"/>
+      <w:pPr>
+        <w:ind w:left="6480" w:hanging="360"/>
+      </w:pPr>
+      <w:rPr>
+        <w:rFonts w:ascii="Wingdings" w:hAnsi="Wingdings" w:hint="default"/>
+      </w:rPr>
+    </w:lvl>
+  </w:abstractNum>
+  <w:abstractNum w:abstractNumId="1" w15:restartNumberingAfterBreak="0">
+    <w:nsid w:val="129F1A2A"/>
+    <w:multiLevelType w:val="hybridMultilevel"/>
+    <w:tmpl w:val="0568D8E6"/>
+    <w:lvl w:ilvl="0" w:tplc="40090001">
+      <w:start w:val="1"/>
+      <w:numFmt w:val="bullet"/>
+      <w:lvlText w:val=""/>
+      <w:lvlJc w:val="left"/>
+      <w:pPr>
+        <w:ind w:left="720" w:hanging="360"/>
+      </w:pPr>
+      <w:rPr>
+        <w:rFonts w:ascii="Symbol" w:hAnsi="Symbol" w:hint="default"/>
+      </w:rPr>
+    </w:lvl>
+    <w:lvl w:ilvl="1" w:tplc="40090003" w:tentative="1">
+      <w:start w:val="1"/>
+      <w:numFmt w:val="bullet"/>
+      <w:lvlText w:val="o"/>
+      <w:lvlJc w:val="left"/>
+      <w:pPr>
+        <w:ind w:left="1440" w:hanging="360"/>
+      </w:pPr>
+      <w:rPr>
+        <w:rFonts w:ascii="Courier New" w:hAnsi="Courier New" w:cs="Courier New" w:hint="default"/>
+      </w:rPr>
+    </w:lvl>
+    <w:lvl w:ilvl="2" w:tplc="40090005" w:tentative="1">
+      <w:start w:val="1"/>
+      <w:numFmt w:val="bullet"/>
+      <w:lvlText w:val=""/>
+      <w:lvlJc w:val="left"/>
+      <w:pPr>
+        <w:ind w:left="2160" w:hanging="360"/>
+      </w:pPr>
+      <w:rPr>
+        <w:rFonts w:ascii="Wingdings" w:hAnsi="Wingdings" w:hint="default"/>
+      </w:rPr>
+    </w:lvl>
+    <w:lvl w:ilvl="3" w:tplc="40090001" w:tentative="1">
+      <w:start w:val="1"/>
+      <w:numFmt w:val="bullet"/>
+      <w:lvlText w:val=""/>
+      <w:lvlJc w:val="left"/>
+      <w:pPr>
+        <w:ind w:left="2880" w:hanging="360"/>
+      </w:pPr>
+      <w:rPr>
+        <w:rFonts w:ascii="Symbol" w:hAnsi="Symbol" w:hint="default"/>
+      </w:rPr>
+    </w:lvl>
+    <w:lvl w:ilvl="4" w:tplc="40090003" w:tentative="1">
+      <w:start w:val="1"/>
+      <w:numFmt w:val="bullet"/>
+      <w:lvlText w:val="o"/>
+      <w:lvlJc w:val="left"/>
+      <w:pPr>
+        <w:ind w:left="3600" w:hanging="360"/>
+      </w:pPr>
+      <w:rPr>
+        <w:rFonts w:ascii="Courier New" w:hAnsi="Courier New" w:cs="Courier New" w:hint="default"/>
+      </w:rPr>
+    </w:lvl>
+    <w:lvl w:ilvl="5" w:tplc="40090005" w:tentative="1">
+      <w:start w:val="1"/>
+      <w:numFmt w:val="bullet"/>
+      <w:lvlText w:val=""/>
+      <w:lvlJc w:val="left"/>
+      <w:pPr>
+        <w:ind w:left="4320" w:hanging="360"/>
+      </w:pPr>
+      <w:rPr>
+        <w:rFonts w:ascii="Wingdings" w:hAnsi="Wingdings" w:hint="default"/>
+      </w:rPr>
+    </w:lvl>
+    <w:lvl w:ilvl="6" w:tplc="40090001" w:tentative="1">
+      <w:start w:val="1"/>
+      <w:numFmt w:val="bullet"/>
+      <w:lvlText w:val=""/>
+      <w:lvlJc w:val="left"/>
+      <w:pPr>
+        <w:ind w:left="5040" w:hanging="360"/>
+      </w:pPr>
+      <w:rPr>
+        <w:rFonts w:ascii="Symbol" w:hAnsi="Symbol" w:hint="default"/>
+      </w:rPr>
+    </w:lvl>
+    <w:lvl w:ilvl="7" w:tplc="40090003" w:tentative="1">
+      <w:start w:val="1"/>
+      <w:numFmt w:val="bullet"/>
+      <w:lvlText w:val="o"/>
+      <w:lvlJc w:val="left"/>
+      <w:pPr>
+        <w:ind w:left="5760" w:hanging="360"/>
+      </w:pPr>
+      <w:rPr>
+        <w:rFonts w:ascii="Courier New" w:hAnsi="Courier New" w:cs="Courier New" w:hint="default"/>
+      </w:rPr>
+    </w:lvl>
+    <w:lvl w:ilvl="8" w:tplc="40090005" w:tentative="1">
+      <w:start w:val="1"/>
+      <w:numFmt w:val="bullet"/>
+      <w:lvlText w:val=""/>
+      <w:lvlJc w:val="left"/>
+      <w:pPr>
+        <w:ind w:left="6480" w:hanging="360"/>
+      </w:pPr>
+      <w:rPr>
+        <w:rFonts w:ascii="Wingdings" w:hAnsi="Wingdings" w:hint="default"/>
+      </w:rPr>
+    </w:lvl>
+  </w:abstractNum>
+  <w:abstractNum w:abstractNumId="2" w15:restartNumberingAfterBreak="0">
+    <w:nsid w:val="2838190A"/>
+    <w:multiLevelType w:val="hybridMultilevel"/>
+    <w:tmpl w:val="E7900376"/>
+    <w:lvl w:ilvl="0" w:tplc="40090001">
+      <w:start w:val="1"/>
+      <w:numFmt w:val="bullet"/>
+      <w:lvlText w:val=""/>
+      <w:lvlJc w:val="left"/>
+      <w:pPr>
+        <w:ind w:left="720" w:hanging="360"/>
+      </w:pPr>
+      <w:rPr>
+        <w:rFonts w:ascii="Symbol" w:hAnsi="Symbol" w:hint="default"/>
+      </w:rPr>
+    </w:lvl>
+    <w:lvl w:ilvl="1" w:tplc="40090003" w:tentative="1">
+      <w:start w:val="1"/>
+      <w:numFmt w:val="bullet"/>
+      <w:lvlText w:val="o"/>
+      <w:lvlJc w:val="left"/>
+      <w:pPr>
+        <w:ind w:left="1440" w:hanging="360"/>
+      </w:pPr>
+      <w:rPr>
+        <w:rFonts w:ascii="Courier New" w:hAnsi="Courier New" w:cs="Courier New" w:hint="default"/>
+      </w:rPr>
+    </w:lvl>
+    <w:lvl w:ilvl="2" w:tplc="40090005" w:tentative="1">
+      <w:start w:val="1"/>
+      <w:numFmt w:val="bullet"/>
+      <w:lvlText w:val=""/>
+      <w:lvlJc w:val="left"/>
+      <w:pPr>
+        <w:ind w:left="2160" w:hanging="360"/>
+      </w:pPr>
+      <w:rPr>
+        <w:rFonts w:ascii="Wingdings" w:hAnsi="Wingdings" w:hint="default"/>
+      </w:rPr>
+    </w:lvl>
+    <w:lvl w:ilvl="3" w:tplc="40090001" w:tentative="1">
+      <w:start w:val="1"/>
+      <w:numFmt w:val="bullet"/>
+      <w:lvlText w:val=""/>
+      <w:lvlJc w:val="left"/>
+      <w:pPr>
+        <w:ind w:left="2880" w:hanging="360"/>
+      </w:pPr>
+      <w:rPr>
+        <w:rFonts w:ascii="Symbol" w:hAnsi="Symbol" w:hint="default"/>
+      </w:rPr>
+    </w:lvl>
+    <w:lvl w:ilvl="4" w:tplc="40090003" w:tentative="1">
+      <w:start w:val="1"/>
+      <w:numFmt w:val="bullet"/>
+      <w:lvlText w:val="o"/>
+      <w:lvlJc w:val="left"/>
+      <w:pPr>
+        <w:ind w:left="3600" w:hanging="360"/>
+      </w:pPr>
+      <w:rPr>
+        <w:rFonts w:ascii="Courier New" w:hAnsi="Courier New" w:cs="Courier New" w:hint="default"/>
+      </w:rPr>
+    </w:lvl>
+    <w:lvl w:ilvl="5" w:tplc="40090005" w:tentative="1">
+      <w:start w:val="1"/>
+      <w:numFmt w:val="bullet"/>
+      <w:lvlText w:val=""/>
+      <w:lvlJc w:val="left"/>
+      <w:pPr>
+        <w:ind w:left="4320" w:hanging="360"/>
+      </w:pPr>
+      <w:rPr>
+        <w:rFonts w:ascii="Wingdings" w:hAnsi="Wingdings" w:hint="default"/>
+      </w:rPr>
+    </w:lvl>
+    <w:lvl w:ilvl="6" w:tplc="40090001" w:tentative="1">
+      <w:start w:val="1"/>
+      <w:numFmt w:val="bullet"/>
+      <w:lvlText w:val=""/>
+      <w:lvlJc w:val="left"/>
+      <w:pPr>
+        <w:ind w:left="5040" w:hanging="360"/>
+      </w:pPr>
+      <w:rPr>
+        <w:rFonts w:ascii="Symbol" w:hAnsi="Symbol" w:hint="default"/>
+      </w:rPr>
+    </w:lvl>
+    <w:lvl w:ilvl="7" w:tplc="40090003" w:tentative="1">
+      <w:start w:val="1"/>
+      <w:numFmt w:val="bullet"/>
+      <w:lvlText w:val="o"/>
+      <w:lvlJc w:val="left"/>
+      <w:pPr>
+        <w:ind w:left="5760" w:hanging="360"/>
+      </w:pPr>
+      <w:rPr>
+        <w:rFonts w:ascii="Courier New" w:hAnsi="Courier New" w:cs="Courier New" w:hint="default"/>
+      </w:rPr>
+    </w:lvl>
+    <w:lvl w:ilvl="8" w:tplc="40090005" w:tentative="1">
+      <w:start w:val="1"/>
+      <w:numFmt w:val="bullet"/>
+      <w:lvlText w:val=""/>
+      <w:lvlJc w:val="left"/>
+      <w:pPr>
+        <w:ind w:left="6480" w:hanging="360"/>
+      </w:pPr>
+      <w:rPr>
+        <w:rFonts w:ascii="Wingdings" w:hAnsi="Wingdings" w:hint="default"/>
+      </w:rPr>
+    </w:lvl>
+  </w:abstractNum>
+  <w:abstractNum w:abstractNumId="3" w15:restartNumberingAfterBreak="0">
     <w:nsid w:val="2FB32C70"/>
     <w:multiLevelType w:val="hybridMultilevel"/>
     <w:tmpl w:val="0242E276"/>
@@ -392,7 +1085,120 @@
       </w:rPr>
     </w:lvl>
   </w:abstractNum>
-  <w:abstractNum w:abstractNumId="1" w15:restartNumberingAfterBreak="0">
+  <w:abstractNum w:abstractNumId="4" w15:restartNumberingAfterBreak="0">
+    <w:nsid w:val="538D1D9F"/>
+    <w:multiLevelType w:val="hybridMultilevel"/>
+    <w:tmpl w:val="494C50DA"/>
+    <w:lvl w:ilvl="0" w:tplc="40090001">
+      <w:start w:val="1"/>
+      <w:numFmt w:val="bullet"/>
+      <w:lvlText w:val=""/>
+      <w:lvlJc w:val="left"/>
+      <w:pPr>
+        <w:ind w:left="720" w:hanging="360"/>
+      </w:pPr>
+      <w:rPr>
+        <w:rFonts w:ascii="Symbol" w:hAnsi="Symbol" w:hint="default"/>
+      </w:rPr>
+    </w:lvl>
+    <w:lvl w:ilvl="1" w:tplc="40090003" w:tentative="1">
+      <w:start w:val="1"/>
+      <w:numFmt w:val="bullet"/>
+      <w:lvlText w:val="o"/>
+      <w:lvlJc w:val="left"/>
+      <w:pPr>
+        <w:ind w:left="1440" w:hanging="360"/>
+      </w:pPr>
+      <w:rPr>
+        <w:rFonts w:ascii="Courier New" w:hAnsi="Courier New" w:cs="Courier New" w:hint="default"/>
+      </w:rPr>
+    </w:lvl>
+    <w:lvl w:ilvl="2" w:tplc="40090005" w:tentative="1">
+      <w:start w:val="1"/>
+      <w:numFmt w:val="bullet"/>
+      <w:lvlText w:val=""/>
+      <w:lvlJc w:val="left"/>
+      <w:pPr>
+        <w:ind w:left="2160" w:hanging="360"/>
+      </w:pPr>
+      <w:rPr>
+        <w:rFonts w:ascii="Wingdings" w:hAnsi="Wingdings" w:hint="default"/>
+      </w:rPr>
+    </w:lvl>
+    <w:lvl w:ilvl="3" w:tplc="40090001" w:tentative="1">
+      <w:start w:val="1"/>
+      <w:numFmt w:val="bullet"/>
+      <w:lvlText w:val=""/>
+      <w:lvlJc w:val="left"/>
+      <w:pPr>
+        <w:ind w:left="2880" w:hanging="360"/>
+      </w:pPr>
+      <w:rPr>
+        <w:rFonts w:ascii="Symbol" w:hAnsi="Symbol" w:hint="default"/>
+      </w:rPr>
+    </w:lvl>
+    <w:lvl w:ilvl="4" w:tplc="40090003" w:tentative="1">
+      <w:start w:val="1"/>
+      <w:numFmt w:val="bullet"/>
+      <w:lvlText w:val="o"/>
+      <w:lvlJc w:val="left"/>
+      <w:pPr>
+        <w:ind w:left="3600" w:hanging="360"/>
+      </w:pPr>
+      <w:rPr>
+        <w:rFonts w:ascii="Courier New" w:hAnsi="Courier New" w:cs="Courier New" w:hint="default"/>
+      </w:rPr>
+    </w:lvl>
+    <w:lvl w:ilvl="5" w:tplc="40090005" w:tentative="1">
+      <w:start w:val="1"/>
+      <w:numFmt w:val="bullet"/>
+      <w:lvlText w:val=""/>
+      <w:lvlJc w:val="left"/>
+      <w:pPr>
+        <w:ind w:left="4320" w:hanging="360"/>
+      </w:pPr>
+      <w:rPr>
+        <w:rFonts w:ascii="Wingdings" w:hAnsi="Wingdings" w:hint="default"/>
+      </w:rPr>
+    </w:lvl>
+    <w:lvl w:ilvl="6" w:tplc="40090001" w:tentative="1">
+      <w:start w:val="1"/>
+      <w:numFmt w:val="bullet"/>
+      <w:lvlText w:val=""/>
+      <w:lvlJc w:val="left"/>
+      <w:pPr>
+        <w:ind w:left="5040" w:hanging="360"/>
+      </w:pPr>
+      <w:rPr>
+        <w:rFonts w:ascii="Symbol" w:hAnsi="Symbol" w:hint="default"/>
+      </w:rPr>
+    </w:lvl>
+    <w:lvl w:ilvl="7" w:tplc="40090003" w:tentative="1">
+      <w:start w:val="1"/>
+      <w:numFmt w:val="bullet"/>
+      <w:lvlText w:val="o"/>
+      <w:lvlJc w:val="left"/>
+      <w:pPr>
+        <w:ind w:left="5760" w:hanging="360"/>
+      </w:pPr>
+      <w:rPr>
+        <w:rFonts w:ascii="Courier New" w:hAnsi="Courier New" w:cs="Courier New" w:hint="default"/>
+      </w:rPr>
+    </w:lvl>
+    <w:lvl w:ilvl="8" w:tplc="40090005" w:tentative="1">
+      <w:start w:val="1"/>
+      <w:numFmt w:val="bullet"/>
+      <w:lvlText w:val=""/>
+      <w:lvlJc w:val="left"/>
+      <w:pPr>
+        <w:ind w:left="6480" w:hanging="360"/>
+      </w:pPr>
+      <w:rPr>
+        <w:rFonts w:ascii="Wingdings" w:hAnsi="Wingdings" w:hint="default"/>
+      </w:rPr>
+    </w:lvl>
+  </w:abstractNum>
+  <w:abstractNum w:abstractNumId="5" w15:restartNumberingAfterBreak="0">
     <w:nsid w:val="680262DE"/>
     <w:multiLevelType w:val="hybridMultilevel"/>
     <w:tmpl w:val="32601B76"/>
@@ -505,7 +1311,7 @@
       </w:rPr>
     </w:lvl>
   </w:abstractNum>
-  <w:abstractNum w:abstractNumId="2" w15:restartNumberingAfterBreak="0">
+  <w:abstractNum w:abstractNumId="6" w15:restartNumberingAfterBreak="0">
     <w:nsid w:val="752F5F02"/>
     <w:multiLevelType w:val="hybridMultilevel"/>
     <w:tmpl w:val="244497DC"/>
@@ -618,14 +1424,142 @@
       </w:rPr>
     </w:lvl>
   </w:abstractNum>
+  <w:abstractNum w:abstractNumId="7" w15:restartNumberingAfterBreak="0">
+    <w:nsid w:val="7A073B7C"/>
+    <w:multiLevelType w:val="hybridMultilevel"/>
+    <w:tmpl w:val="6A56FD9E"/>
+    <w:lvl w:ilvl="0" w:tplc="40090001">
+      <w:start w:val="1"/>
+      <w:numFmt w:val="bullet"/>
+      <w:lvlText w:val=""/>
+      <w:lvlJc w:val="left"/>
+      <w:pPr>
+        <w:ind w:left="1440" w:hanging="360"/>
+      </w:pPr>
+      <w:rPr>
+        <w:rFonts w:ascii="Symbol" w:hAnsi="Symbol" w:hint="default"/>
+      </w:rPr>
+    </w:lvl>
+    <w:lvl w:ilvl="1" w:tplc="40090003" w:tentative="1">
+      <w:start w:val="1"/>
+      <w:numFmt w:val="bullet"/>
+      <w:lvlText w:val="o"/>
+      <w:lvlJc w:val="left"/>
+      <w:pPr>
+        <w:ind w:left="2160" w:hanging="360"/>
+      </w:pPr>
+      <w:rPr>
+        <w:rFonts w:ascii="Courier New" w:hAnsi="Courier New" w:cs="Courier New" w:hint="default"/>
+      </w:rPr>
+    </w:lvl>
+    <w:lvl w:ilvl="2" w:tplc="40090005" w:tentative="1">
+      <w:start w:val="1"/>
+      <w:numFmt w:val="bullet"/>
+      <w:lvlText w:val=""/>
+      <w:lvlJc w:val="left"/>
+      <w:pPr>
+        <w:ind w:left="2880" w:hanging="360"/>
+      </w:pPr>
+      <w:rPr>
+        <w:rFonts w:ascii="Wingdings" w:hAnsi="Wingdings" w:hint="default"/>
+      </w:rPr>
+    </w:lvl>
+    <w:lvl w:ilvl="3" w:tplc="40090001" w:tentative="1">
+      <w:start w:val="1"/>
+      <w:numFmt w:val="bullet"/>
+      <w:lvlText w:val=""/>
+      <w:lvlJc w:val="left"/>
+      <w:pPr>
+        <w:ind w:left="3600" w:hanging="360"/>
+      </w:pPr>
+      <w:rPr>
+        <w:rFonts w:ascii="Symbol" w:hAnsi="Symbol" w:hint="default"/>
+      </w:rPr>
+    </w:lvl>
+    <w:lvl w:ilvl="4" w:tplc="40090003" w:tentative="1">
+      <w:start w:val="1"/>
+      <w:numFmt w:val="bullet"/>
+      <w:lvlText w:val="o"/>
+      <w:lvlJc w:val="left"/>
+      <w:pPr>
+        <w:ind w:left="4320" w:hanging="360"/>
+      </w:pPr>
+      <w:rPr>
+        <w:rFonts w:ascii="Courier New" w:hAnsi="Courier New" w:cs="Courier New" w:hint="default"/>
+      </w:rPr>
+    </w:lvl>
+    <w:lvl w:ilvl="5" w:tplc="40090005" w:tentative="1">
+      <w:start w:val="1"/>
+      <w:numFmt w:val="bullet"/>
+      <w:lvlText w:val=""/>
+      <w:lvlJc w:val="left"/>
+      <w:pPr>
+        <w:ind w:left="5040" w:hanging="360"/>
+      </w:pPr>
+      <w:rPr>
+        <w:rFonts w:ascii="Wingdings" w:hAnsi="Wingdings" w:hint="default"/>
+      </w:rPr>
+    </w:lvl>
+    <w:lvl w:ilvl="6" w:tplc="40090001" w:tentative="1">
+      <w:start w:val="1"/>
+      <w:numFmt w:val="bullet"/>
+      <w:lvlText w:val=""/>
+      <w:lvlJc w:val="left"/>
+      <w:pPr>
+        <w:ind w:left="5760" w:hanging="360"/>
+      </w:pPr>
+      <w:rPr>
+        <w:rFonts w:ascii="Symbol" w:hAnsi="Symbol" w:hint="default"/>
+      </w:rPr>
+    </w:lvl>
+    <w:lvl w:ilvl="7" w:tplc="40090003" w:tentative="1">
+      <w:start w:val="1"/>
+      <w:numFmt w:val="bullet"/>
+      <w:lvlText w:val="o"/>
+      <w:lvlJc w:val="left"/>
+      <w:pPr>
+        <w:ind w:left="6480" w:hanging="360"/>
+      </w:pPr>
+      <w:rPr>
+        <w:rFonts w:ascii="Courier New" w:hAnsi="Courier New" w:cs="Courier New" w:hint="default"/>
+      </w:rPr>
+    </w:lvl>
+    <w:lvl w:ilvl="8" w:tplc="40090005" w:tentative="1">
+      <w:start w:val="1"/>
+      <w:numFmt w:val="bullet"/>
+      <w:lvlText w:val=""/>
+      <w:lvlJc w:val="left"/>
+      <w:pPr>
+        <w:ind w:left="7200" w:hanging="360"/>
+      </w:pPr>
+      <w:rPr>
+        <w:rFonts w:ascii="Wingdings" w:hAnsi="Wingdings" w:hint="default"/>
+      </w:rPr>
+    </w:lvl>
+  </w:abstractNum>
   <w:num w:numId="1" w16cid:durableId="1867787596">
+    <w:abstractNumId w:val="6"/>
+  </w:num>
+  <w:num w:numId="2" w16cid:durableId="1474173078">
+    <w:abstractNumId w:val="5"/>
+  </w:num>
+  <w:num w:numId="3" w16cid:durableId="903369314">
+    <w:abstractNumId w:val="3"/>
+  </w:num>
+  <w:num w:numId="4" w16cid:durableId="1545172622">
+    <w:abstractNumId w:val="7"/>
+  </w:num>
+  <w:num w:numId="5" w16cid:durableId="548300498">
+    <w:abstractNumId w:val="4"/>
+  </w:num>
+  <w:num w:numId="6" w16cid:durableId="1839420278">
     <w:abstractNumId w:val="2"/>
   </w:num>
-  <w:num w:numId="2" w16cid:durableId="1474173078">
+  <w:num w:numId="7" w16cid:durableId="1684016178">
+    <w:abstractNumId w:val="0"/>
+  </w:num>
+  <w:num w:numId="8" w16cid:durableId="660155595">
     <w:abstractNumId w:val="1"/>
-  </w:num>
-  <w:num w:numId="3" w16cid:durableId="903369314">
-    <w:abstractNumId w:val="0"/>
   </w:num>
 </w:numbering>
 </file>
@@ -1233,7 +2167,6 @@
   <w:style w:type="character" w:default="1" w:styleId="DefaultParagraphFont">
     <w:name w:val="Default Paragraph Font"/>
     <w:uiPriority w:val="1"/>
-    <w:semiHidden/>
     <w:unhideWhenUsed/>
   </w:style>
   <w:style w:type="table" w:default="1" w:styleId="TableNormal">

</xml_diff>

<commit_message>
Moved github_token from the URL query parameters to the Authorization header
</commit_message>
<xml_diff>
--- a/Summary.docx
+++ b/Summary.docx
@@ -71,12 +71,21 @@
           <w:szCs w:val="28"/>
         </w:rPr>
       </w:pPr>
-      <w:r>
-        <w:rPr>
-          <w:sz w:val="28"/>
-          <w:szCs w:val="28"/>
-        </w:rPr>
-        <w:t>venv\Scripts\activate</w:t>
+      <w:proofErr w:type="spellStart"/>
+      <w:r>
+        <w:rPr>
+          <w:sz w:val="28"/>
+          <w:szCs w:val="28"/>
+        </w:rPr>
+        <w:t>venv</w:t>
+      </w:r>
+      <w:proofErr w:type="spellEnd"/>
+      <w:r>
+        <w:rPr>
+          <w:sz w:val="28"/>
+          <w:szCs w:val="28"/>
+        </w:rPr>
+        <w:t>\Scripts\activate</w:t>
       </w:r>
     </w:p>
     <w:p>
@@ -88,12 +97,37 @@
           <w:szCs w:val="28"/>
         </w:rPr>
       </w:pPr>
-      <w:r>
-        <w:rPr>
-          <w:sz w:val="28"/>
-          <w:szCs w:val="28"/>
-        </w:rPr>
-        <w:t>uvicorn main:app --reload --port 8000</w:t>
+      <w:proofErr w:type="spellStart"/>
+      <w:r>
+        <w:rPr>
+          <w:sz w:val="28"/>
+          <w:szCs w:val="28"/>
+        </w:rPr>
+        <w:t>uvicorn</w:t>
+      </w:r>
+      <w:proofErr w:type="spellEnd"/>
+      <w:r>
+        <w:rPr>
+          <w:sz w:val="28"/>
+          <w:szCs w:val="28"/>
+        </w:rPr>
+        <w:t xml:space="preserve"> </w:t>
+      </w:r>
+      <w:proofErr w:type="spellStart"/>
+      <w:r>
+        <w:rPr>
+          <w:sz w:val="28"/>
+          <w:szCs w:val="28"/>
+        </w:rPr>
+        <w:t>main:app</w:t>
+      </w:r>
+      <w:proofErr w:type="spellEnd"/>
+      <w:r>
+        <w:rPr>
+          <w:sz w:val="28"/>
+          <w:szCs w:val="28"/>
+        </w:rPr>
+        <w:t xml:space="preserve"> --reload --port 8000</w:t>
       </w:r>
     </w:p>
     <w:p>
@@ -141,6 +175,7 @@
           <w:szCs w:val="28"/>
         </w:rPr>
       </w:pPr>
+      <w:proofErr w:type="spellStart"/>
       <w:r>
         <w:rPr>
           <w:b/>
@@ -148,26 +183,56 @@
           <w:sz w:val="28"/>
           <w:szCs w:val="28"/>
         </w:rPr>
-        <w:t>pnpm dev</w:t>
-      </w:r>
-    </w:p>
-    <w:p>
-      <w:pPr>
+        <w:t>pnpm</w:t>
+      </w:r>
+      <w:proofErr w:type="spellEnd"/>
+      <w:r>
         <w:rPr>
           <w:b/>
           <w:bCs/>
           <w:sz w:val="28"/>
           <w:szCs w:val="28"/>
         </w:rPr>
-      </w:pPr>
-      <w:r>
+        <w:t xml:space="preserve"> dev</w:t>
+      </w:r>
+    </w:p>
+    <w:p>
+      <w:pPr>
         <w:rPr>
           <w:b/>
           <w:bCs/>
           <w:sz w:val="28"/>
           <w:szCs w:val="28"/>
         </w:rPr>
-        <w:t>Terminal 3[ngrok (in development stage)]</w:t>
+      </w:pPr>
+      <w:r>
+        <w:rPr>
+          <w:b/>
+          <w:bCs/>
+          <w:sz w:val="28"/>
+          <w:szCs w:val="28"/>
+        </w:rPr>
+        <w:t>Terminal 3[</w:t>
+      </w:r>
+      <w:proofErr w:type="spellStart"/>
+      <w:r>
+        <w:rPr>
+          <w:b/>
+          <w:bCs/>
+          <w:sz w:val="28"/>
+          <w:szCs w:val="28"/>
+        </w:rPr>
+        <w:t>ngrok</w:t>
+      </w:r>
+      <w:proofErr w:type="spellEnd"/>
+      <w:r>
+        <w:rPr>
+          <w:b/>
+          <w:bCs/>
+          <w:sz w:val="28"/>
+          <w:szCs w:val="28"/>
+        </w:rPr>
+        <w:t xml:space="preserve"> (in development stage)]</w:t>
       </w:r>
     </w:p>
     <w:p>
@@ -265,14 +330,7 @@
           <w:sz w:val="28"/>
           <w:szCs w:val="28"/>
         </w:rPr>
-        <w:t>Homepage URL:</w:t>
-      </w:r>
-      <w:r>
-        <w:rPr>
-          <w:sz w:val="28"/>
-          <w:szCs w:val="28"/>
-        </w:rPr>
-        <w:t xml:space="preserve"> “”</w:t>
+        <w:t>Homepage URL: “”</w:t>
       </w:r>
     </w:p>
     <w:p>
@@ -379,7 +437,23 @@
           <w:sz w:val="28"/>
           <w:szCs w:val="28"/>
         </w:rPr>
-        <w:t>Go to github.com/rajeshrk10/firstsenior → Settings → Webhooks → update</w:t>
+        <w:t>Go to github.com/rajeshrk10/</w:t>
+      </w:r>
+      <w:proofErr w:type="spellStart"/>
+      <w:r>
+        <w:rPr>
+          <w:sz w:val="28"/>
+          <w:szCs w:val="28"/>
+        </w:rPr>
+        <w:t>firstsenior</w:t>
+      </w:r>
+      <w:proofErr w:type="spellEnd"/>
+      <w:r>
+        <w:rPr>
+          <w:sz w:val="28"/>
+          <w:szCs w:val="28"/>
+        </w:rPr>
+        <w:t xml:space="preserve"> → Settings → Webhooks → update</w:t>
       </w:r>
       <w:r>
         <w:rPr>
@@ -596,8 +670,65 @@
           <w:sz w:val="28"/>
           <w:szCs w:val="28"/>
         </w:rPr>
-        <w:t>DATABASE_URL=your_neon_connection_string GROQ_API_KEY=your_groq_key GITHUB_WEBHOOK_SECRET=firstsenior123 GITHUB_CLIENT_ID=your_client_id GITHUB_CLIENT_SECRET=your_client_secret</w:t>
-      </w:r>
+        <w:t>DATABASE_URL=</w:t>
+      </w:r>
+      <w:proofErr w:type="spellStart"/>
+      <w:r>
+        <w:rPr>
+          <w:sz w:val="28"/>
+          <w:szCs w:val="28"/>
+        </w:rPr>
+        <w:t>your_neon_connection_string</w:t>
+      </w:r>
+      <w:proofErr w:type="spellEnd"/>
+      <w:r>
+        <w:rPr>
+          <w:sz w:val="28"/>
+          <w:szCs w:val="28"/>
+        </w:rPr>
+        <w:t xml:space="preserve"> GROQ_API_KEY=</w:t>
+      </w:r>
+      <w:proofErr w:type="spellStart"/>
+      <w:r>
+        <w:rPr>
+          <w:sz w:val="28"/>
+          <w:szCs w:val="28"/>
+        </w:rPr>
+        <w:t>your_groq_key</w:t>
+      </w:r>
+      <w:proofErr w:type="spellEnd"/>
+      <w:r>
+        <w:rPr>
+          <w:sz w:val="28"/>
+          <w:szCs w:val="28"/>
+        </w:rPr>
+        <w:t xml:space="preserve"> GITHUB_WEBHOOK_SECRET=firstsenior123 GITHUB_CLIENT_ID=</w:t>
+      </w:r>
+      <w:proofErr w:type="spellStart"/>
+      <w:r>
+        <w:rPr>
+          <w:sz w:val="28"/>
+          <w:szCs w:val="28"/>
+        </w:rPr>
+        <w:t>your_client_id</w:t>
+      </w:r>
+      <w:proofErr w:type="spellEnd"/>
+      <w:r>
+        <w:rPr>
+          <w:sz w:val="28"/>
+          <w:szCs w:val="28"/>
+        </w:rPr>
+        <w:t xml:space="preserve"> GITHUB_CLIENT_SECRET=</w:t>
+      </w:r>
+      <w:proofErr w:type="spellStart"/>
+      <w:r>
+        <w:rPr>
+          <w:sz w:val="28"/>
+          <w:szCs w:val="28"/>
+        </w:rPr>
+        <w:t>your_client_secret</w:t>
+      </w:r>
+      <w:proofErr w:type="spellEnd"/>
     </w:p>
     <w:p>
       <w:pPr>
@@ -620,6 +751,72 @@
         </w:rPr>
         <w:t>604daf9c02187bb891800888ce048aa01dea08f9</w:t>
       </w:r>
+    </w:p>
+    <w:p>
+      <w:pPr>
+        <w:rPr>
+          <w:sz w:val="28"/>
+          <w:szCs w:val="28"/>
+        </w:rPr>
+      </w:pPr>
+    </w:p>
+    <w:p>
+      <w:pPr>
+        <w:rPr>
+          <w:sz w:val="28"/>
+          <w:szCs w:val="28"/>
+        </w:rPr>
+      </w:pPr>
+      <w:r>
+        <w:rPr>
+          <w:sz w:val="28"/>
+          <w:szCs w:val="28"/>
+        </w:rPr>
+        <w:t xml:space="preserve">Live URL Frontend: </w:t>
+      </w:r>
+      <w:hyperlink r:id="rId5" w:history="1">
+        <w:r>
+          <w:rPr>
+            <w:rStyle w:val="Hyperlink"/>
+            <w:sz w:val="28"/>
+            <w:szCs w:val="28"/>
+          </w:rPr>
+          <w:t>https://firstsenior.vercel.app/</w:t>
+        </w:r>
+      </w:hyperlink>
+    </w:p>
+    <w:p>
+      <w:pPr>
+        <w:rPr>
+          <w:sz w:val="28"/>
+          <w:szCs w:val="28"/>
+        </w:rPr>
+      </w:pPr>
+      <w:r>
+        <w:rPr>
+          <w:sz w:val="28"/>
+          <w:szCs w:val="28"/>
+        </w:rPr>
+        <w:t xml:space="preserve">Live URL Backend: </w:t>
+      </w:r>
+      <w:hyperlink r:id="rId6" w:history="1">
+        <w:r>
+          <w:rPr>
+            <w:rStyle w:val="Hyperlink"/>
+            <w:sz w:val="28"/>
+            <w:szCs w:val="28"/>
+          </w:rPr>
+          <w:t>https://firstsenior-production.up.railway.app/</w:t>
+        </w:r>
+      </w:hyperlink>
+    </w:p>
+    <w:p>
+      <w:pPr>
+        <w:rPr>
+          <w:sz w:val="28"/>
+          <w:szCs w:val="28"/>
+        </w:rPr>
+      </w:pPr>
     </w:p>
     <w:sectPr>
       <w:pgSz w:w="11906" w:h="16838"/>
@@ -2167,6 +2364,7 @@
   <w:style w:type="character" w:default="1" w:styleId="DefaultParagraphFont">
     <w:name w:val="Default Paragraph Font"/>
     <w:uiPriority w:val="1"/>
+    <w:semiHidden/>
     <w:unhideWhenUsed/>
   </w:style>
   <w:style w:type="table" w:default="1" w:styleId="TableNormal">
@@ -2478,6 +2676,29 @@
       <w:smallCaps/>
       <w:color w:val="0F4761" w:themeColor="accent1" w:themeShade="BF"/>
       <w:spacing w:val="5"/>
+    </w:rPr>
+  </w:style>
+  <w:style w:type="character" w:styleId="Hyperlink">
+    <w:name w:val="Hyperlink"/>
+    <w:basedOn w:val="DefaultParagraphFont"/>
+    <w:uiPriority w:val="99"/>
+    <w:unhideWhenUsed/>
+    <w:rsid w:val="006B4F8F"/>
+    <w:rPr>
+      <w:color w:val="467886" w:themeColor="hyperlink"/>
+      <w:u w:val="single"/>
+    </w:rPr>
+  </w:style>
+  <w:style w:type="character" w:styleId="UnresolvedMention">
+    <w:name w:val="Unresolved Mention"/>
+    <w:basedOn w:val="DefaultParagraphFont"/>
+    <w:uiPriority w:val="99"/>
+    <w:semiHidden/>
+    <w:unhideWhenUsed/>
+    <w:rsid w:val="006B4F8F"/>
+    <w:rPr>
+      <w:color w:val="605E5C"/>
+      <w:shd w:val="clear" w:color="auto" w:fill="E1DFDD"/>
     </w:rPr>
   </w:style>
 </w:styles>

</xml_diff>